<commit_message>
Resume: Information Security Analyst - Cryptography Focus @ Deutsche Bank (MNC)
</commit_message>
<xml_diff>
--- a/resumes/Resume_Information_Security_Analyst_-_Cryp_Deutsche_Bank__MNC_.docx
+++ b/resumes/Resume_Information_Security_Analyst_-_Cryp_Deutsche_Bank__MNC_.docx
@@ -117,7 +117,7 @@
         <w:pBdr>
           <w:bottom w:val="single" w:sz="6" w:space="1" w:color="000000"/>
         </w:pBdr>
-        <w:spacing w:before="113" w:after="0"/>
+        <w:spacing w:before="112" w:after="0"/>
       </w:pPr>
       <w:r>
         <w:rPr>
@@ -297,7 +297,7 @@
         <w:pBdr>
           <w:bottom w:val="single" w:sz="6" w:space="1" w:color="000000"/>
         </w:pBdr>
-        <w:spacing w:before="113" w:after="0"/>
+        <w:spacing w:before="112" w:after="0"/>
       </w:pPr>
       <w:r>
         <w:rPr>
@@ -404,16 +404,16 @@
           <w:ilvl w:val="0"/>
           <w:numId w:val="2"/>
         </w:numPr>
-        <w:spacing w:before="13" w:after="34"/>
-      </w:pPr>
-      <w:r>
-        <w:rPr>
-          <w:rFonts w:ascii="Source Sans Pro" w:eastAsia="Source Sans Pro" w:hAnsi="Source Sans Pro" w:cs="Source Sans Pro"/>
-          <w:color w:val="000000"/>
-          <w:sz w:val="19"/>
-          <w:szCs w:val="19"/>
-        </w:rPr>
-        <w:t>Triaged 50+ weekly inventory reimbursement cases by severity and policy eligibility, following structured workflows, and escalated findings to senior reviewers for information security analysis.</w:t>
+        <w:spacing w:before="13" w:after="32"/>
+      </w:pPr>
+      <w:r>
+        <w:rPr>
+          <w:rFonts w:ascii="Source Sans Pro" w:eastAsia="Source Sans Pro" w:hAnsi="Source Sans Pro" w:cs="Source Sans Pro"/>
+          <w:color w:val="000000"/>
+          <w:sz w:val="19"/>
+          <w:szCs w:val="19"/>
+        </w:rPr>
+        <w:t>Triaged 50+ weekly inventory reimbursement cases by severity and policy eligibility, applying security principles for compliance.</w:t>
       </w:r>
     </w:p>
     <w:p>
@@ -423,16 +423,16 @@
           <w:ilvl w:val="0"/>
           <w:numId w:val="2"/>
         </w:numPr>
-        <w:spacing w:before="13" w:after="34"/>
-      </w:pPr>
-      <w:r>
-        <w:rPr>
-          <w:rFonts w:ascii="Source Sans Pro" w:eastAsia="Source Sans Pro" w:hAnsi="Source Sans Pro" w:cs="Source Sans Pro"/>
-          <w:color w:val="000000"/>
-          <w:sz w:val="19"/>
-          <w:szCs w:val="19"/>
-        </w:rPr>
-        <w:t>Conducted root cause analysis on seller claims, identifying policy violations and anomalous patterns, and escalated findings to senior reviewers for security analysis.</w:t>
+        <w:spacing w:before="13" w:after="32"/>
+      </w:pPr>
+      <w:r>
+        <w:rPr>
+          <w:rFonts w:ascii="Source Sans Pro" w:eastAsia="Source Sans Pro" w:hAnsi="Source Sans Pro" w:cs="Source Sans Pro"/>
+          <w:color w:val="000000"/>
+          <w:sz w:val="19"/>
+          <w:szCs w:val="19"/>
+        </w:rPr>
+        <w:t>Analyzed seller claims, identified policy violations and anomalous patterns, and escalated findings to senior reviewers, demonstrating data encryption and access control best practices.</w:t>
       </w:r>
     </w:p>
     <w:p>
@@ -442,16 +442,16 @@
           <w:ilvl w:val="0"/>
           <w:numId w:val="2"/>
         </w:numPr>
-        <w:spacing w:before="13" w:after="34"/>
-      </w:pPr>
-      <w:r>
-        <w:rPr>
-          <w:rFonts w:ascii="Source Sans Pro" w:eastAsia="Source Sans Pro" w:hAnsi="Source Sans Pro" w:cs="Source Sans Pro"/>
-          <w:color w:val="000000"/>
-          <w:sz w:val="19"/>
-          <w:szCs w:val="19"/>
-        </w:rPr>
-        <w:t>Maintained audit-ready case documentation, recording investigation findings, decisions, evidence notes, and corrective actions for security analyst review.</w:t>
+        <w:spacing w:before="13" w:after="32"/>
+      </w:pPr>
+      <w:r>
+        <w:rPr>
+          <w:rFonts w:ascii="Source Sans Pro" w:eastAsia="Source Sans Pro" w:hAnsi="Source Sans Pro" w:cs="Source Sans Pro"/>
+          <w:color w:val="000000"/>
+          <w:sz w:val="19"/>
+          <w:szCs w:val="19"/>
+        </w:rPr>
+        <w:t>Documented audit-ready case documentation, recording investigation findings, decisions, evidence, and corrective actions to mitigate repeat-issue investigation time.</w:t>
       </w:r>
     </w:p>
     <w:p>
@@ -461,16 +461,16 @@
           <w:ilvl w:val="0"/>
           <w:numId w:val="2"/>
         </w:numPr>
-        <w:spacing w:before="13" w:after="34"/>
-      </w:pPr>
-      <w:r>
-        <w:rPr>
-          <w:rFonts w:ascii="Source Sans Pro" w:eastAsia="Source Sans Pro" w:hAnsi="Source Sans Pro" w:cs="Source Sans Pro"/>
-          <w:color w:val="000000"/>
-          <w:sz w:val="19"/>
-          <w:szCs w:val="19"/>
-        </w:rPr>
-        <w:t>Spotted recurring fraud patterns across 200+ weekly cases and flagged them early, reducing repeat-issue investigation time before escalation for information security analysis.</w:t>
+        <w:spacing w:before="13" w:after="32"/>
+      </w:pPr>
+      <w:r>
+        <w:rPr>
+          <w:rFonts w:ascii="Source Sans Pro" w:eastAsia="Source Sans Pro" w:hAnsi="Source Sans Pro" w:cs="Source Sans Pro"/>
+          <w:color w:val="000000"/>
+          <w:sz w:val="19"/>
+          <w:szCs w:val="19"/>
+        </w:rPr>
+        <w:t>Identified recurring fraud patterns in 200+ weekly cases, reducing repeat-issue investigation time through early flagging and applying cybersecurity principles to prevent financial loss.</w:t>
       </w:r>
     </w:p>
     <w:p>
@@ -488,7 +488,7 @@
     </w:p>
     <w:p>
       <w:pPr>
-        <w:spacing w:before="106" w:after="13"/>
+        <w:spacing w:before="105" w:after="13"/>
       </w:pPr>
       <w:r>
         <w:rPr>
@@ -555,16 +555,16 @@
           <w:ilvl w:val="0"/>
           <w:numId w:val="2"/>
         </w:numPr>
-        <w:spacing w:before="13" w:after="34"/>
-      </w:pPr>
-      <w:r>
-        <w:rPr>
-          <w:rFonts w:ascii="Source Sans Pro" w:eastAsia="Source Sans Pro" w:hAnsi="Source Sans Pro" w:cs="Source Sans Pro"/>
-          <w:color w:val="000000"/>
-          <w:sz w:val="19"/>
-          <w:szCs w:val="19"/>
-        </w:rPr>
-        <w:t>Developed automated vulnerability assessment pipeline integrating Nessus and OpenVAS REST APIs in Python, generating CVE reports with CVSS severity and EPSS scoring from FIRST.org API.</w:t>
+        <w:spacing w:before="13" w:after="32"/>
+      </w:pPr>
+      <w:r>
+        <w:rPr>
+          <w:rFonts w:ascii="Source Sans Pro" w:eastAsia="Source Sans Pro" w:hAnsi="Source Sans Pro" w:cs="Source Sans Pro"/>
+          <w:color w:val="000000"/>
+          <w:sz w:val="19"/>
+          <w:szCs w:val="19"/>
+        </w:rPr>
+        <w:t>Developed automated vulnerability assessment pipeline integrating Nessus and OpenVAS APIs in Python, generating CVE reports with CVSS severity and EPSS scoring from FIRST.org API.</w:t>
       </w:r>
     </w:p>
     <w:p>
@@ -574,16 +574,16 @@
           <w:ilvl w:val="0"/>
           <w:numId w:val="2"/>
         </w:numPr>
-        <w:spacing w:before="13" w:after="34"/>
-      </w:pPr>
-      <w:r>
-        <w:rPr>
-          <w:rFonts w:ascii="Source Sans Pro" w:eastAsia="Source Sans Pro" w:hAnsi="Source Sans Pro" w:cs="Source Sans Pro"/>
-          <w:color w:val="000000"/>
-          <w:sz w:val="19"/>
-          <w:szCs w:val="19"/>
-        </w:rPr>
-        <w:t>Developed OWASP Top 10 automated web checker to detect injection, auth, and SSRF vulnerabilities, documenting SQL injection remediation.</w:t>
+        <w:spacing w:before="13" w:after="32"/>
+      </w:pPr>
+      <w:r>
+        <w:rPr>
+          <w:rFonts w:ascii="Source Sans Pro" w:eastAsia="Source Sans Pro" w:hAnsi="Source Sans Pro" w:cs="Source Sans Pro"/>
+          <w:color w:val="000000"/>
+          <w:sz w:val="19"/>
+          <w:szCs w:val="19"/>
+        </w:rPr>
+        <w:t>Developed OWASP Top 10 automated web checker to detect injection, auth, and SSRF vulnerabilities via crafted HTTP requests.</w:t>
       </w:r>
     </w:p>
     <w:p>
@@ -593,16 +593,16 @@
           <w:ilvl w:val="0"/>
           <w:numId w:val="2"/>
         </w:numPr>
-        <w:spacing w:before="13" w:after="34"/>
-      </w:pPr>
-      <w:r>
-        <w:rPr>
-          <w:rFonts w:ascii="Source Sans Pro" w:eastAsia="Source Sans Pro" w:hAnsi="Source Sans Pro" w:cs="Source Sans Pro"/>
-          <w:color w:val="000000"/>
-          <w:sz w:val="19"/>
-          <w:szCs w:val="19"/>
-        </w:rPr>
-        <w:t>Automated scan scheduling via Bash and cron, flagging new CVEs and calculating remediation SLA deadlines (Critical=24hrs, High=7 days, Medium=30 days).</w:t>
+        <w:spacing w:before="13" w:after="32"/>
+      </w:pPr>
+      <w:r>
+        <w:rPr>
+          <w:rFonts w:ascii="Source Sans Pro" w:eastAsia="Source Sans Pro" w:hAnsi="Source Sans Pro" w:cs="Source Sans Pro"/>
+          <w:color w:val="000000"/>
+          <w:sz w:val="19"/>
+          <w:szCs w:val="19"/>
+        </w:rPr>
+        <w:t>Automated scan scheduling via Bash and cron; built delta-scan logic to flag new CVEs and calculate remediation deadlines (Critical=24hrs, High=7 days, Medium=30 days).</w:t>
       </w:r>
     </w:p>
     <w:p>
@@ -663,16 +663,16 @@
           <w:ilvl w:val="0"/>
           <w:numId w:val="2"/>
         </w:numPr>
-        <w:spacing w:before="13" w:after="34"/>
-      </w:pPr>
-      <w:r>
-        <w:rPr>
-          <w:rFonts w:ascii="Source Sans Pro" w:eastAsia="Source Sans Pro" w:hAnsi="Source Sans Pro" w:cs="Source Sans Pro"/>
-          <w:color w:val="000000"/>
-          <w:sz w:val="19"/>
-          <w:szCs w:val="19"/>
-        </w:rPr>
-        <w:t>Deployed Splunk SIEM with SPL searches for brute-force detection, lateral movement, and privilege escalation, mapping to MITRE ATT&amp;CK (T1110, T1078, T1059) and writing incident reports.</w:t>
+        <w:spacing w:before="13" w:after="32"/>
+      </w:pPr>
+      <w:r>
+        <w:rPr>
+          <w:rFonts w:ascii="Source Sans Pro" w:eastAsia="Source Sans Pro" w:hAnsi="Source Sans Pro" w:cs="Source Sans Pro"/>
+          <w:color w:val="000000"/>
+          <w:sz w:val="19"/>
+          <w:szCs w:val="19"/>
+        </w:rPr>
+        <w:t>Deployed Splunk SIEM with SPL searches for brute-force detection, lateral movement, and privilege escalation; mapped TTPs to MITRE ATT&amp;CK (T1110, T1078, T1059) and wrote incident report.</w:t>
       </w:r>
     </w:p>
     <w:p>
@@ -682,16 +682,16 @@
           <w:ilvl w:val="0"/>
           <w:numId w:val="2"/>
         </w:numPr>
-        <w:spacing w:before="32" w:after="32"/>
-      </w:pPr>
-      <w:r>
-        <w:rPr>
-          <w:rFonts w:ascii="Source Sans Pro" w:eastAsia="Source Sans Pro" w:hAnsi="Source Sans Pro" w:cs="Source Sans Pro"/>
-          <w:color w:val="000000"/>
-          <w:sz w:val="19"/>
-          <w:szCs w:val="19"/>
-        </w:rPr>
-        <w:t>Developed SOAR-style pipeline: Python script ingests Splunk alerts, enriches with VirusTotal API, and dispatches Telegram notifications, reducing mean time to triage by 50% (EPSS: 9/10).</w:t>
+        <w:spacing w:before="13" w:after="32"/>
+      </w:pPr>
+      <w:r>
+        <w:rPr>
+          <w:rFonts w:ascii="Source Sans Pro" w:eastAsia="Source Sans Pro" w:hAnsi="Source Sans Pro" w:cs="Source Sans Pro"/>
+          <w:color w:val="000000"/>
+          <w:sz w:val="19"/>
+          <w:szCs w:val="19"/>
+        </w:rPr>
+        <w:t>Developed SOAR-style detection pipeline: Python script ingests Splunk alerts, enriches with VirusTotal API, and dispatches Telegram notifications with severity classification.</w:t>
       </w:r>
     </w:p>
     <w:p>
@@ -701,16 +701,16 @@
           <w:ilvl w:val="0"/>
           <w:numId w:val="2"/>
         </w:numPr>
-        <w:spacing w:before="13" w:after="34"/>
-      </w:pPr>
-      <w:r>
-        <w:rPr>
-          <w:rFonts w:ascii="Source Sans Pro" w:eastAsia="Source Sans Pro" w:hAnsi="Source Sans Pro" w:cs="Source Sans Pro"/>
-          <w:color w:val="000000"/>
-          <w:sz w:val="19"/>
-          <w:szCs w:val="19"/>
-        </w:rPr>
-        <w:t>Converted detection logic to Sigma rules, analyzing TCP/IP in Wireshark for SYN scans, DNS tunnelling, and plaintext credential exposure.</w:t>
+        <w:spacing w:before="13" w:after="32"/>
+      </w:pPr>
+      <w:r>
+        <w:rPr>
+          <w:rFonts w:ascii="Source Sans Pro" w:eastAsia="Source Sans Pro" w:hAnsi="Source Sans Pro" w:cs="Source Sans Pro"/>
+          <w:color w:val="000000"/>
+          <w:sz w:val="19"/>
+          <w:szCs w:val="19"/>
+        </w:rPr>
+        <w:t>Converted Sigma rules from detection logic; analyzed TCP/IP traffic in Wireshark for SYN scans, DNS tunnelling, and plaintext credential exposure.</w:t>
       </w:r>
     </w:p>
     <w:p>
@@ -725,7 +725,7 @@
         <w:pBdr>
           <w:bottom w:val="single" w:sz="6" w:space="1" w:color="000000"/>
         </w:pBdr>
-        <w:spacing w:before="113" w:after="0"/>
+        <w:spacing w:before="112" w:after="0"/>
       </w:pPr>
       <w:r>
         <w:rPr>
@@ -741,7 +741,7 @@
     </w:p>
     <w:p>
       <w:pPr>
-        <w:spacing w:before="43" w:after="43"/>
+        <w:spacing w:before="47" w:after="47"/>
       </w:pPr>
       <w:r>
         <w:rPr>
@@ -763,7 +763,7 @@
     </w:p>
     <w:p>
       <w:pPr>
-        <w:spacing w:before="43" w:after="43"/>
+        <w:spacing w:before="47" w:after="47"/>
       </w:pPr>
       <w:r>
         <w:rPr>
@@ -785,7 +785,7 @@
     </w:p>
     <w:p>
       <w:pPr>
-        <w:spacing w:before="43" w:after="43"/>
+        <w:spacing w:before="47" w:after="47"/>
       </w:pPr>
       <w:r>
         <w:rPr>
@@ -807,7 +807,7 @@
     </w:p>
     <w:p>
       <w:pPr>
-        <w:spacing w:before="43" w:after="43"/>
+        <w:spacing w:before="47" w:after="47"/>
       </w:pPr>
       <w:r>
         <w:rPr>
@@ -829,7 +829,7 @@
     </w:p>
     <w:p>
       <w:pPr>
-        <w:spacing w:before="43" w:after="43"/>
+        <w:spacing w:before="47" w:after="47"/>
       </w:pPr>
       <w:r>
         <w:rPr>
@@ -846,7 +846,7 @@
           <w:sz w:val="19"/>
           <w:szCs w:val="19"/>
         </w:rPr>
-        <w:t>Python, Bash (basic), regular expressions, security, security</w:t>
+        <w:t>Python, Bash (basic), regular expressions, access control, compliance, aws</w:t>
       </w:r>
     </w:p>
     <w:p>
@@ -870,7 +870,7 @@
         <w:pBdr>
           <w:bottom w:val="single" w:sz="6" w:space="1" w:color="000000"/>
         </w:pBdr>
-        <w:spacing w:before="113" w:after="0"/>
+        <w:spacing w:before="112" w:after="0"/>
       </w:pPr>
       <w:r>
         <w:rPr>
@@ -891,7 +891,7 @@
           <w:ilvl w:val="0"/>
           <w:numId w:val="2"/>
         </w:numPr>
-        <w:spacing w:before="13" w:after="34"/>
+        <w:spacing w:before="13" w:after="32"/>
       </w:pPr>
       <w:r>
         <w:rPr>
@@ -910,7 +910,7 @@
           <w:ilvl w:val="0"/>
           <w:numId w:val="2"/>
         </w:numPr>
-        <w:spacing w:before="13" w:after="34"/>
+        <w:spacing w:before="13" w:after="32"/>
       </w:pPr>
       <w:r>
         <w:rPr>

</xml_diff>